<commit_message>
Deploying to gh-pages from @ Morrison-Lab/mds@9a19814b1d08691881cfda941a0e2e476b6a37c1 🚀
</commit_message>
<xml_diff>
--- a/calculus-integration.docx
+++ b/calculus-integration.docx
@@ -15,7 +15,7 @@
         <w:pStyle w:val="Date"/>
       </w:pPr>
       <w:r>
-        <w:t xml:space="preserve">Last modified: 2026-10-15 09:23:43 (PDT)</w:t>
+        <w:t xml:space="preserve">Last modified: 2026-10-15 10:07:44 (PDT)</w:t>
       </w:r>
     </w:p>
     <w:bookmarkStart w:id="171" w:name="sec-integration"/>
@@ -4567,7 +4567,7 @@
           <w:rPr>
             <w:rStyle w:val="Hyperlink"/>
           </w:rPr>
-          <w:t xml:space="preserve">Definition 4 in Derivatives and Taylor Series</w:t>
+          <w:t xml:space="preserve">Definition 6 in Derivatives and Taylor Series</w:t>
         </w:r>
       </w:hyperlink>
       <w:r>
@@ -4610,7 +4610,7 @@
           <w:rPr>
             <w:rStyle w:val="Hyperlink"/>
           </w:rPr>
-          <w:t xml:space="preserve">Definition 6 in Derivatives and Taylor Series</w:t>
+          <w:t xml:space="preserve">Definition 12 in Derivatives and Taylor Series</w:t>
         </w:r>
       </w:hyperlink>
       <w:r>
@@ -6625,7 +6625,7 @@
           <w:rPr>
             <w:rStyle w:val="Hyperlink"/>
           </w:rPr>
-          <w:t xml:space="preserve">Definition 2 in Derivatives and Taylor Series</w:t>
+          <w:t xml:space="preserve">Definition 4 in Derivatives and Taylor Series</w:t>
         </w:r>
       </w:hyperlink>
       <w:r>

</xml_diff>